<commit_message>
Improvements to Install Guide
</commit_message>
<xml_diff>
--- a/lynx_install_guide.docx
+++ b/lynx_install_guide.docx
@@ -2441,6 +2441,48 @@
       </w:pPr>
       <w:r>
         <w:t xml:space="preserve">Lynx's own web app prints detailed startup and request logs directly to the terminal it's running in — visible in the terminal window on the Pi's own desktop if using the autostart method (Section 7). Scroll back through it for the specific error.</w:t>
+      </w:r>
+    </w:p>
+    <w:p>
+      <w:pPr>
+        <w:pStyle w:val="Heading2"/>
+        <w:spacing w:after="150" w:before="300"/>
+      </w:pPr>
+      <w:r>
+        <w:t xml:space="preserve">11.9 Reboot button (or Update Now) fails with a passwordless sudo error</w:t>
+      </w:r>
+    </w:p>
+    <w:p>
+      <w:pPr>
+        <w:spacing w:after="150"/>
+      </w:pPr>
+      <w:r>
+        <w:t xml:space="preserve">Both depend on the user Lynx runs as being able to run ‘sudo reboot’ without a password prompt - the default on standard Raspberry Pi OS, but worth confirming directly if either ever fails with this specific error. Fix (run on the Pi over SSH):</w:t>
+      </w:r>
+    </w:p>
+    <w:p>
+      <w:pPr>
+        <w:shd w:fill="F0F0F0" w:val="clear"/>
+        <w:spacing w:after="150" w:before="100"/>
+        <w:ind w:left="360"/>
+      </w:pPr>
+      <w:r>
+        <w:rPr>
+          <w:rFonts w:ascii="Consolas" w:cs="Consolas" w:eastAsia="Consolas" w:hAnsi="Consolas"/>
+          <w:sz w:val="20"/>
+          <w:szCs w:val="20"/>
+        </w:rPr>
+        <w:t xml:space="preserve">echo "$USER ALL=(ALL) NOPASSWD: /sbin/reboot, /usr/sbin/reboot" | sudo tee /etc/sudoers.d/lynx-reboot
+sudo chmod 0440 /etc/sudoers.d/lynx-reboot
+sudo visudo -c</w:t>
+      </w:r>
+    </w:p>
+    <w:p>
+      <w:pPr>
+        <w:spacing w:after="150"/>
+      </w:pPr>
+      <w:r>
+        <w:t xml:space="preserve">A dedicated file in /etc/sudoers.d/ rather than editing /etc/sudoers directly - easy to review or remove on its own, and ‘visudo -c’ validates the syntax of all sudoers files without needing an editor, catching a typo before it can lock sudo out entirely.</w:t>
       </w:r>
     </w:p>
     <w:p>

</xml_diff>